<commit_message>
FIX: Actualización de documentación
</commit_message>
<xml_diff>
--- a/docs/word/API.docx
+++ b/docs/word/API.docx
@@ -300,14 +300,14 @@
                 <w:rFonts w:ascii="Times New Roman" w:hAnsi="Times New Roman"/>
                 <w:sz w:val="20"/>
               </w:rPr>
-              <w:t>Ing. Vanessa Guevar</w:t>
+              <w:t xml:space="preserve">Ing. </w:t>
             </w:r>
             <w:r>
               <w:rPr>
                 <w:rFonts w:ascii="Times New Roman" w:hAnsi="Times New Roman"/>
                 <w:sz w:val="20"/>
               </w:rPr>
-              <w:t>a</w:t>
+              <w:t xml:space="preserve">Milton Román </w:t>
             </w:r>
           </w:p>
         </w:tc>
@@ -497,7 +497,7 @@
         <w:rPr>
           <w:rFonts w:ascii="Times New Roman" w:hAnsi="Times New Roman"/>
         </w:rPr>
-        <w:t>Ariel Arias</w:t>
+        <w:t xml:space="preserve">Arias Ariel </w:t>
       </w:r>
     </w:p>
     <w:p>
@@ -514,18 +514,45 @@
         </w:rPr>
         <w:t xml:space="preserve">Pazmiño Emily </w:t>
       </w:r>
+    </w:p>
+    <w:p>
+      <w:pPr>
+        <w:spacing w:before="160"/>
+        <w:jc w:val="center"/>
+        <w:rPr>
+          <w:rFonts w:ascii="Times New Roman" w:hAnsi="Times New Roman"/>
+        </w:rPr>
+      </w:pPr>
+      <w:r>
+        <w:rPr>
+          <w:rFonts w:ascii="Times New Roman" w:hAnsi="Times New Roman"/>
+        </w:rPr>
+        <w:t xml:space="preserve">Tana Emilia </w:t>
+      </w:r>
+    </w:p>
+    <w:p>
+      <w:pPr>
+        <w:spacing w:before="160"/>
+        <w:jc w:val="center"/>
+        <w:rPr>
+          <w:rFonts w:ascii="Times New Roman" w:hAnsi="Times New Roman"/>
+        </w:rPr>
+      </w:pPr>
+    </w:p>
+    <w:p>
+      <w:pPr>
+        <w:spacing w:before="160"/>
+        <w:jc w:val="center"/>
+        <w:rPr>
+          <w:rFonts w:ascii="Times New Roman" w:hAnsi="Times New Roman"/>
+        </w:rPr>
+      </w:pPr>
     </w:p>
     <w:p>
       <w:pPr>
         <w:spacing w:before="160"/>
         <w:jc w:val="center"/>
       </w:pPr>
-      <w:r>
-        <w:rPr>
-          <w:rFonts w:ascii="Times New Roman" w:hAnsi="Times New Roman"/>
-        </w:rPr>
-        <w:t>Emilia Tana</w:t>
-      </w:r>
     </w:p>
     <w:p>
       <w:pPr>
@@ -551,14 +578,1043 @@
       <w:r>
         <w:br w:type="page"/>
       </w:r>
+    </w:p>
+    <w:p>
+      <w:pPr>
+        <w:pStyle w:val="Titulos"/>
+        <w:spacing w:line="360" w:lineRule="auto"/>
+      </w:pPr>
+      <w:r>
+        <w:lastRenderedPageBreak/>
+        <w:t>ÍNDICE DE CONTENIDO</w:t>
+      </w:r>
+    </w:p>
+    <w:sdt>
+      <w:sdtPr>
+        <w:rPr>
+          <w:rFonts w:ascii="Arial" w:eastAsiaTheme="minorEastAsia" w:hAnsi="Arial" w:cstheme="minorBidi"/>
+          <w:b w:val="0"/>
+          <w:bCs w:val="0"/>
+          <w:color w:val="auto"/>
+          <w:sz w:val="22"/>
+          <w:szCs w:val="22"/>
+          <w:lang w:val="es-ES"/>
+        </w:rPr>
+        <w:id w:val="-2007810510"/>
+        <w:docPartObj>
+          <w:docPartGallery w:val="Table of Contents"/>
+          <w:docPartUnique/>
+        </w:docPartObj>
+      </w:sdtPr>
+      <w:sdtEndPr/>
+      <w:sdtContent>
+        <w:p>
+          <w:pPr>
+            <w:pStyle w:val="TtuloTDC"/>
+          </w:pPr>
+        </w:p>
+        <w:p>
+          <w:pPr>
+            <w:pStyle w:val="TDC1"/>
+            <w:tabs>
+              <w:tab w:val="right" w:leader="dot" w:pos="9062"/>
+            </w:tabs>
+            <w:rPr>
+              <w:noProof/>
+            </w:rPr>
+          </w:pPr>
+          <w:r>
+            <w:fldChar w:fldCharType="begin"/>
+          </w:r>
+          <w:r>
+            <w:instrText xml:space="preserve"> TOC \o "1-3" \h \z \u </w:instrText>
+          </w:r>
+          <w:r>
+            <w:fldChar w:fldCharType="separate"/>
+          </w:r>
+          <w:hyperlink w:anchor="_Toc235221197" w:history="1">
+            <w:r>
+              <w:rPr>
+                <w:rStyle w:val="Hipervnculo"/>
+                <w:noProof/>
+              </w:rPr>
+              <w:t>INFORMACIÓN GENERAL</w:t>
+            </w:r>
+            <w:r>
+              <w:rPr>
+                <w:noProof/>
+                <w:webHidden/>
+              </w:rPr>
+              <w:tab/>
+            </w:r>
+            <w:r>
+              <w:rPr>
+                <w:noProof/>
+                <w:webHidden/>
+              </w:rPr>
+              <w:fldChar w:fldCharType="begin"/>
+            </w:r>
+            <w:r>
+              <w:rPr>
+                <w:noProof/>
+                <w:webHidden/>
+              </w:rPr>
+              <w:instrText xml:space="preserve"> PAGEREF _Toc235221197 \h </w:instrText>
+            </w:r>
+            <w:r>
+              <w:rPr>
+                <w:noProof/>
+                <w:webHidden/>
+              </w:rPr>
+            </w:r>
+            <w:r>
+              <w:rPr>
+                <w:noProof/>
+                <w:webHidden/>
+              </w:rPr>
+              <w:fldChar w:fldCharType="separate"/>
+            </w:r>
+            <w:r>
+              <w:rPr>
+                <w:noProof/>
+                <w:webHidden/>
+              </w:rPr>
+              <w:t>3</w:t>
+            </w:r>
+            <w:r>
+              <w:rPr>
+                <w:noProof/>
+                <w:webHidden/>
+              </w:rPr>
+              <w:fldChar w:fldCharType="end"/>
+            </w:r>
+          </w:hyperlink>
+        </w:p>
+        <w:p>
+          <w:pPr>
+            <w:pStyle w:val="TDC1"/>
+            <w:tabs>
+              <w:tab w:val="right" w:leader="dot" w:pos="9062"/>
+            </w:tabs>
+            <w:rPr>
+              <w:noProof/>
+            </w:rPr>
+          </w:pPr>
+          <w:hyperlink w:anchor="_Toc235221198" w:history="1">
+            <w:r>
+              <w:rPr>
+                <w:rStyle w:val="Hipervnculo"/>
+                <w:noProof/>
+              </w:rPr>
+              <w:t>RESUMEN DE ENDPOINTS</w:t>
+            </w:r>
+            <w:r>
+              <w:rPr>
+                <w:noProof/>
+                <w:webHidden/>
+              </w:rPr>
+              <w:tab/>
+            </w:r>
+            <w:r>
+              <w:rPr>
+                <w:noProof/>
+                <w:webHidden/>
+              </w:rPr>
+              <w:fldChar w:fldCharType="begin"/>
+            </w:r>
+            <w:r>
+              <w:rPr>
+                <w:noProof/>
+                <w:webHidden/>
+              </w:rPr>
+              <w:instrText xml:space="preserve"> PAGEREF _Toc235221198 \h </w:instrText>
+            </w:r>
+            <w:r>
+              <w:rPr>
+                <w:noProof/>
+                <w:webHidden/>
+              </w:rPr>
+            </w:r>
+            <w:r>
+              <w:rPr>
+                <w:noProof/>
+                <w:webHidden/>
+              </w:rPr>
+              <w:fldChar w:fldCharType="separate"/>
+            </w:r>
+            <w:r>
+              <w:rPr>
+                <w:noProof/>
+                <w:webHidden/>
+              </w:rPr>
+              <w:t>3</w:t>
+            </w:r>
+            <w:r>
+              <w:rPr>
+                <w:noProof/>
+                <w:webHidden/>
+              </w:rPr>
+              <w:fldChar w:fldCharType="end"/>
+            </w:r>
+          </w:hyperlink>
+        </w:p>
+        <w:p>
+          <w:pPr>
+            <w:pStyle w:val="TDC1"/>
+            <w:tabs>
+              <w:tab w:val="right" w:leader="dot" w:pos="9062"/>
+            </w:tabs>
+            <w:rPr>
+              <w:noProof/>
+            </w:rPr>
+          </w:pPr>
+          <w:hyperlink w:anchor="_Toc235221199" w:history="1">
+            <w:r>
+              <w:rPr>
+                <w:rStyle w:val="Hipervnculo"/>
+                <w:noProof/>
+              </w:rPr>
+              <w:t>`GET /`</w:t>
+            </w:r>
+            <w:r>
+              <w:rPr>
+                <w:noProof/>
+                <w:webHidden/>
+              </w:rPr>
+              <w:tab/>
+            </w:r>
+            <w:r>
+              <w:rPr>
+                <w:noProof/>
+                <w:webHidden/>
+              </w:rPr>
+              <w:fldChar w:fldCharType="begin"/>
+            </w:r>
+            <w:r>
+              <w:rPr>
+                <w:noProof/>
+                <w:webHidden/>
+              </w:rPr>
+              <w:instrText xml:space="preserve"> PAGEREF _Toc235221199 \h </w:instrText>
+            </w:r>
+            <w:r>
+              <w:rPr>
+                <w:noProof/>
+                <w:webHidden/>
+              </w:rPr>
+            </w:r>
+            <w:r>
+              <w:rPr>
+                <w:noProof/>
+                <w:webHidden/>
+              </w:rPr>
+              <w:fldChar w:fldCharType="separate"/>
+            </w:r>
+            <w:r>
+              <w:rPr>
+                <w:noProof/>
+                <w:webHidden/>
+              </w:rPr>
+              <w:t>3</w:t>
+            </w:r>
+            <w:r>
+              <w:rPr>
+                <w:noProof/>
+                <w:webHidden/>
+              </w:rPr>
+              <w:fldChar w:fldCharType="end"/>
+            </w:r>
+          </w:hyperlink>
+        </w:p>
+        <w:p>
+          <w:pPr>
+            <w:pStyle w:val="TDC1"/>
+            <w:tabs>
+              <w:tab w:val="right" w:leader="dot" w:pos="9062"/>
+            </w:tabs>
+            <w:rPr>
+              <w:noProof/>
+            </w:rPr>
+          </w:pPr>
+          <w:hyperlink w:anchor="_Toc235221200" w:history="1">
+            <w:r>
+              <w:rPr>
+                <w:rStyle w:val="Hipervnculo"/>
+                <w:noProof/>
+              </w:rPr>
+              <w:t>`GET /HEALTH`</w:t>
+            </w:r>
+            <w:r>
+              <w:rPr>
+                <w:noProof/>
+                <w:webHidden/>
+              </w:rPr>
+              <w:tab/>
+            </w:r>
+            <w:r>
+              <w:rPr>
+                <w:noProof/>
+                <w:webHidden/>
+              </w:rPr>
+              <w:fldChar w:fldCharType="begin"/>
+            </w:r>
+            <w:r>
+              <w:rPr>
+                <w:noProof/>
+                <w:webHidden/>
+              </w:rPr>
+              <w:instrText xml:space="preserve"> PAGEREF _Toc235221200 \h </w:instrText>
+            </w:r>
+            <w:r>
+              <w:rPr>
+                <w:noProof/>
+                <w:webHidden/>
+              </w:rPr>
+            </w:r>
+            <w:r>
+              <w:rPr>
+                <w:noProof/>
+                <w:webHidden/>
+              </w:rPr>
+              <w:fldChar w:fldCharType="separate"/>
+            </w:r>
+            <w:r>
+              <w:rPr>
+                <w:noProof/>
+                <w:webHidden/>
+              </w:rPr>
+              <w:t>3</w:t>
+            </w:r>
+            <w:r>
+              <w:rPr>
+                <w:noProof/>
+                <w:webHidden/>
+              </w:rPr>
+              <w:fldChar w:fldCharType="end"/>
+            </w:r>
+          </w:hyperlink>
+        </w:p>
+        <w:p>
+          <w:pPr>
+            <w:pStyle w:val="TDC1"/>
+            <w:tabs>
+              <w:tab w:val="right" w:leader="dot" w:pos="9062"/>
+            </w:tabs>
+            <w:rPr>
+              <w:noProof/>
+            </w:rPr>
+          </w:pPr>
+          <w:hyperlink w:anchor="_Toc235221201" w:history="1">
+            <w:r>
+              <w:rPr>
+                <w:rStyle w:val="Hipervnculo"/>
+                <w:noProof/>
+              </w:rPr>
+              <w:t>`GET /STATUS`</w:t>
+            </w:r>
+            <w:r>
+              <w:rPr>
+                <w:noProof/>
+                <w:webHidden/>
+              </w:rPr>
+              <w:tab/>
+            </w:r>
+            <w:r>
+              <w:rPr>
+                <w:noProof/>
+                <w:webHidden/>
+              </w:rPr>
+              <w:fldChar w:fldCharType="begin"/>
+            </w:r>
+            <w:r>
+              <w:rPr>
+                <w:noProof/>
+                <w:webHidden/>
+              </w:rPr>
+              <w:instrText xml:space="preserve"> PAGEREF _Toc235221201 \h </w:instrText>
+            </w:r>
+            <w:r>
+              <w:rPr>
+                <w:noProof/>
+                <w:webHidden/>
+              </w:rPr>
+            </w:r>
+            <w:r>
+              <w:rPr>
+                <w:noProof/>
+                <w:webHidden/>
+              </w:rPr>
+              <w:fldChar w:fldCharType="separate"/>
+            </w:r>
+            <w:r>
+              <w:rPr>
+                <w:noProof/>
+                <w:webHidden/>
+              </w:rPr>
+              <w:t>3</w:t>
+            </w:r>
+            <w:r>
+              <w:rPr>
+                <w:noProof/>
+                <w:webHidden/>
+              </w:rPr>
+              <w:fldChar w:fldCharType="end"/>
+            </w:r>
+          </w:hyperlink>
+        </w:p>
+        <w:p>
+          <w:pPr>
+            <w:pStyle w:val="TDC1"/>
+            <w:tabs>
+              <w:tab w:val="right" w:leader="dot" w:pos="9062"/>
+            </w:tabs>
+            <w:rPr>
+              <w:noProof/>
+            </w:rPr>
+          </w:pPr>
+          <w:hyperlink w:anchor="_Toc235221202" w:history="1">
+            <w:r>
+              <w:rPr>
+                <w:rStyle w:val="Hipervnculo"/>
+                <w:noProof/>
+              </w:rPr>
+              <w:t>`GET /CONFIG`</w:t>
+            </w:r>
+            <w:r>
+              <w:rPr>
+                <w:noProof/>
+                <w:webHidden/>
+              </w:rPr>
+              <w:tab/>
+            </w:r>
+            <w:r>
+              <w:rPr>
+                <w:noProof/>
+                <w:webHidden/>
+              </w:rPr>
+              <w:fldChar w:fldCharType="begin"/>
+            </w:r>
+            <w:r>
+              <w:rPr>
+                <w:noProof/>
+                <w:webHidden/>
+              </w:rPr>
+              <w:instrText xml:space="preserve"> PAGEREF _Toc235221202 \h </w:instrText>
+            </w:r>
+            <w:r>
+              <w:rPr>
+                <w:noProof/>
+                <w:webHidden/>
+              </w:rPr>
+            </w:r>
+            <w:r>
+              <w:rPr>
+                <w:noProof/>
+                <w:webHidden/>
+              </w:rPr>
+              <w:fldChar w:fldCharType="separate"/>
+            </w:r>
+            <w:r>
+              <w:rPr>
+                <w:noProof/>
+                <w:webHidden/>
+              </w:rPr>
+              <w:t>4</w:t>
+            </w:r>
+            <w:r>
+              <w:rPr>
+                <w:noProof/>
+                <w:webHidden/>
+              </w:rPr>
+              <w:fldChar w:fldCharType="end"/>
+            </w:r>
+          </w:hyperlink>
+        </w:p>
+        <w:p>
+          <w:pPr>
+            <w:pStyle w:val="TDC1"/>
+            <w:tabs>
+              <w:tab w:val="right" w:leader="dot" w:pos="9062"/>
+            </w:tabs>
+            <w:rPr>
+              <w:noProof/>
+            </w:rPr>
+          </w:pPr>
+          <w:hyperlink w:anchor="_Toc235221203" w:history="1">
+            <w:r>
+              <w:rPr>
+                <w:rStyle w:val="Hipervnculo"/>
+                <w:noProof/>
+              </w:rPr>
+              <w:t>`POST /CONFIG`</w:t>
+            </w:r>
+            <w:r>
+              <w:rPr>
+                <w:noProof/>
+                <w:webHidden/>
+              </w:rPr>
+              <w:tab/>
+            </w:r>
+            <w:r>
+              <w:rPr>
+                <w:noProof/>
+                <w:webHidden/>
+              </w:rPr>
+              <w:fldChar w:fldCharType="begin"/>
+            </w:r>
+            <w:r>
+              <w:rPr>
+                <w:noProof/>
+                <w:webHidden/>
+              </w:rPr>
+              <w:instrText xml:space="preserve"> PAGEREF _Toc235221203 \h </w:instrText>
+            </w:r>
+            <w:r>
+              <w:rPr>
+                <w:noProof/>
+                <w:webHidden/>
+              </w:rPr>
+            </w:r>
+            <w:r>
+              <w:rPr>
+                <w:noProof/>
+                <w:webHidden/>
+              </w:rPr>
+              <w:fldChar w:fldCharType="separate"/>
+            </w:r>
+            <w:r>
+              <w:rPr>
+                <w:noProof/>
+                <w:webHidden/>
+              </w:rPr>
+              <w:t>4</w:t>
+            </w:r>
+            <w:r>
+              <w:rPr>
+                <w:noProof/>
+                <w:webHidden/>
+              </w:rPr>
+              <w:fldChar w:fldCharType="end"/>
+            </w:r>
+          </w:hyperlink>
+        </w:p>
+        <w:p>
+          <w:pPr>
+            <w:pStyle w:val="TDC1"/>
+            <w:tabs>
+              <w:tab w:val="right" w:leader="dot" w:pos="9062"/>
+            </w:tabs>
+            <w:rPr>
+              <w:noProof/>
+            </w:rPr>
+          </w:pPr>
+          <w:hyperlink w:anchor="_Toc235221204" w:history="1">
+            <w:r>
+              <w:rPr>
+                <w:rStyle w:val="Hipervnculo"/>
+                <w:noProof/>
+              </w:rPr>
+              <w:t>`POST /TRAIN`</w:t>
+            </w:r>
+            <w:r>
+              <w:rPr>
+                <w:noProof/>
+                <w:webHidden/>
+              </w:rPr>
+              <w:tab/>
+            </w:r>
+            <w:r>
+              <w:rPr>
+                <w:noProof/>
+                <w:webHidden/>
+              </w:rPr>
+              <w:fldChar w:fldCharType="begin"/>
+            </w:r>
+            <w:r>
+              <w:rPr>
+                <w:noProof/>
+                <w:webHidden/>
+              </w:rPr>
+              <w:instrText xml:space="preserve"> PAGEREF _Toc235221204 \h </w:instrText>
+            </w:r>
+            <w:r>
+              <w:rPr>
+                <w:noProof/>
+                <w:webHidden/>
+              </w:rPr>
+            </w:r>
+            <w:r>
+              <w:rPr>
+                <w:noProof/>
+                <w:webHidden/>
+              </w:rPr>
+              <w:fldChar w:fldCharType="separate"/>
+            </w:r>
+            <w:r>
+              <w:rPr>
+                <w:noProof/>
+                <w:webHidden/>
+              </w:rPr>
+              <w:t>4</w:t>
+            </w:r>
+            <w:r>
+              <w:rPr>
+                <w:noProof/>
+                <w:webHidden/>
+              </w:rPr>
+              <w:fldChar w:fldCharType="end"/>
+            </w:r>
+          </w:hyperlink>
+        </w:p>
+        <w:p>
+          <w:pPr>
+            <w:pStyle w:val="TDC1"/>
+            <w:tabs>
+              <w:tab w:val="right" w:leader="dot" w:pos="9062"/>
+            </w:tabs>
+            <w:rPr>
+              <w:noProof/>
+            </w:rPr>
+          </w:pPr>
+          <w:hyperlink w:anchor="_Toc235221205" w:history="1">
+            <w:r>
+              <w:rPr>
+                <w:rStyle w:val="Hipervnculo"/>
+                <w:noProof/>
+              </w:rPr>
+              <w:t>`GET /METRICS`</w:t>
+            </w:r>
+            <w:r>
+              <w:rPr>
+                <w:noProof/>
+                <w:webHidden/>
+              </w:rPr>
+              <w:tab/>
+            </w:r>
+            <w:r>
+              <w:rPr>
+                <w:noProof/>
+                <w:webHidden/>
+              </w:rPr>
+              <w:fldChar w:fldCharType="begin"/>
+            </w:r>
+            <w:r>
+              <w:rPr>
+                <w:noProof/>
+                <w:webHidden/>
+              </w:rPr>
+              <w:instrText xml:space="preserve"> PAGEREF _Toc235221205 \h </w:instrText>
+            </w:r>
+            <w:r>
+              <w:rPr>
+                <w:noProof/>
+                <w:webHidden/>
+              </w:rPr>
+            </w:r>
+            <w:r>
+              <w:rPr>
+                <w:noProof/>
+                <w:webHidden/>
+              </w:rPr>
+              <w:fldChar w:fldCharType="separate"/>
+            </w:r>
+            <w:r>
+              <w:rPr>
+                <w:noProof/>
+                <w:webHidden/>
+              </w:rPr>
+              <w:t>5</w:t>
+            </w:r>
+            <w:r>
+              <w:rPr>
+                <w:noProof/>
+                <w:webHidden/>
+              </w:rPr>
+              <w:fldChar w:fldCharType="end"/>
+            </w:r>
+          </w:hyperlink>
+        </w:p>
+        <w:p>
+          <w:pPr>
+            <w:pStyle w:val="TDC1"/>
+            <w:tabs>
+              <w:tab w:val="right" w:leader="dot" w:pos="9062"/>
+            </w:tabs>
+            <w:rPr>
+              <w:noProof/>
+            </w:rPr>
+          </w:pPr>
+          <w:hyperlink w:anchor="_Toc235221206" w:history="1">
+            <w:r>
+              <w:rPr>
+                <w:rStyle w:val="Hipervnculo"/>
+                <w:noProof/>
+              </w:rPr>
+              <w:t>`POST /PREDICT`</w:t>
+            </w:r>
+            <w:r>
+              <w:rPr>
+                <w:noProof/>
+                <w:webHidden/>
+              </w:rPr>
+              <w:tab/>
+            </w:r>
+            <w:r>
+              <w:rPr>
+                <w:noProof/>
+                <w:webHidden/>
+              </w:rPr>
+              <w:fldChar w:fldCharType="begin"/>
+            </w:r>
+            <w:r>
+              <w:rPr>
+                <w:noProof/>
+                <w:webHidden/>
+              </w:rPr>
+              <w:instrText xml:space="preserve"> PAGEREF _Toc235221206 \h </w:instrText>
+            </w:r>
+            <w:r>
+              <w:rPr>
+                <w:noProof/>
+                <w:webHidden/>
+              </w:rPr>
+            </w:r>
+            <w:r>
+              <w:rPr>
+                <w:noProof/>
+                <w:webHidden/>
+              </w:rPr>
+              <w:fldChar w:fldCharType="separate"/>
+            </w:r>
+            <w:r>
+              <w:rPr>
+                <w:noProof/>
+                <w:webHidden/>
+              </w:rPr>
+              <w:t>5</w:t>
+            </w:r>
+            <w:r>
+              <w:rPr>
+                <w:noProof/>
+                <w:webHidden/>
+              </w:rPr>
+              <w:fldChar w:fldCharType="end"/>
+            </w:r>
+          </w:hyperlink>
+        </w:p>
+        <w:p>
+          <w:pPr>
+            <w:pStyle w:val="TDC1"/>
+            <w:tabs>
+              <w:tab w:val="right" w:leader="dot" w:pos="9062"/>
+            </w:tabs>
+            <w:rPr>
+              <w:noProof/>
+            </w:rPr>
+          </w:pPr>
+          <w:hyperlink w:anchor="_Toc235221207" w:history="1">
+            <w:r>
+              <w:rPr>
+                <w:rStyle w:val="Hipervnculo"/>
+                <w:noProof/>
+              </w:rPr>
+              <w:t>CÓDIGOS HTTP</w:t>
+            </w:r>
+            <w:r>
+              <w:rPr>
+                <w:noProof/>
+                <w:webHidden/>
+              </w:rPr>
+              <w:tab/>
+            </w:r>
+            <w:r>
+              <w:rPr>
+                <w:noProof/>
+                <w:webHidden/>
+              </w:rPr>
+              <w:fldChar w:fldCharType="begin"/>
+            </w:r>
+            <w:r>
+              <w:rPr>
+                <w:noProof/>
+                <w:webHidden/>
+              </w:rPr>
+              <w:instrText xml:space="preserve"> PAGEREF _Toc235221207 \h </w:instrText>
+            </w:r>
+            <w:r>
+              <w:rPr>
+                <w:noProof/>
+                <w:webHidden/>
+              </w:rPr>
+            </w:r>
+            <w:r>
+              <w:rPr>
+                <w:noProof/>
+                <w:webHidden/>
+              </w:rPr>
+              <w:fldChar w:fldCharType="separate"/>
+            </w:r>
+            <w:r>
+              <w:rPr>
+                <w:noProof/>
+                <w:webHidden/>
+              </w:rPr>
+              <w:t>6</w:t>
+            </w:r>
+            <w:r>
+              <w:rPr>
+                <w:noProof/>
+                <w:webHidden/>
+              </w:rPr>
+              <w:fldChar w:fldCharType="end"/>
+            </w:r>
+          </w:hyperlink>
+        </w:p>
+        <w:p>
+          <w:pPr>
+            <w:pStyle w:val="TDC1"/>
+            <w:tabs>
+              <w:tab w:val="right" w:leader="dot" w:pos="9062"/>
+            </w:tabs>
+            <w:rPr>
+              <w:noProof/>
+            </w:rPr>
+          </w:pPr>
+          <w:hyperlink w:anchor="_Toc235221208" w:history="1">
+            <w:r>
+              <w:rPr>
+                <w:rStyle w:val="Hipervnculo"/>
+                <w:noProof/>
+              </w:rPr>
+              <w:t>OBSERVACIONES DE INTEGRACIÓN</w:t>
+            </w:r>
+            <w:r>
+              <w:rPr>
+                <w:noProof/>
+                <w:webHidden/>
+              </w:rPr>
+              <w:tab/>
+            </w:r>
+            <w:r>
+              <w:rPr>
+                <w:noProof/>
+                <w:webHidden/>
+              </w:rPr>
+              <w:fldChar w:fldCharType="begin"/>
+            </w:r>
+            <w:r>
+              <w:rPr>
+                <w:noProof/>
+                <w:webHidden/>
+              </w:rPr>
+              <w:instrText xml:space="preserve"> PAGEREF _Toc235221208 \h </w:instrText>
+            </w:r>
+            <w:r>
+              <w:rPr>
+                <w:noProof/>
+                <w:webHidden/>
+              </w:rPr>
+            </w:r>
+            <w:r>
+              <w:rPr>
+                <w:noProof/>
+                <w:webHidden/>
+              </w:rPr>
+              <w:fldChar w:fldCharType="separate"/>
+            </w:r>
+            <w:r>
+              <w:rPr>
+                <w:noProof/>
+                <w:webHidden/>
+              </w:rPr>
+              <w:t>6</w:t>
+            </w:r>
+            <w:r>
+              <w:rPr>
+                <w:noProof/>
+                <w:webHidden/>
+              </w:rPr>
+              <w:fldChar w:fldCharType="end"/>
+            </w:r>
+          </w:hyperlink>
+        </w:p>
+        <w:p>
+          <w:r>
+            <w:rPr>
+              <w:b/>
+              <w:bCs/>
+              <w:lang w:val="es-ES"/>
+            </w:rPr>
+            <w:fldChar w:fldCharType="end"/>
+          </w:r>
+        </w:p>
+      </w:sdtContent>
+    </w:sdt>
+    <w:p>
+      <w:pPr>
+        <w:spacing w:after="200"/>
+        <w:rPr>
+          <w:rFonts w:asciiTheme="majorHAnsi" w:eastAsiaTheme="majorEastAsia" w:hAnsiTheme="majorHAnsi" w:cstheme="majorBidi"/>
+          <w:b/>
+          <w:color w:val="17365D"/>
+          <w:spacing w:val="5"/>
+          <w:kern w:val="28"/>
+          <w:sz w:val="44"/>
+          <w:szCs w:val="52"/>
+        </w:rPr>
+      </w:pPr>
+    </w:p>
+    <w:p>
+      <w:pPr>
+        <w:spacing w:after="200"/>
+        <w:rPr>
+          <w:rFonts w:asciiTheme="majorHAnsi" w:eastAsiaTheme="majorEastAsia" w:hAnsiTheme="majorHAnsi" w:cstheme="majorBidi"/>
+          <w:b/>
+          <w:color w:val="17365D"/>
+          <w:spacing w:val="5"/>
+          <w:kern w:val="28"/>
+          <w:sz w:val="44"/>
+          <w:szCs w:val="52"/>
+        </w:rPr>
+      </w:pPr>
+    </w:p>
+    <w:p>
+      <w:pPr>
+        <w:spacing w:after="200"/>
+        <w:rPr>
+          <w:rFonts w:asciiTheme="majorHAnsi" w:eastAsiaTheme="majorEastAsia" w:hAnsiTheme="majorHAnsi" w:cstheme="majorBidi"/>
+          <w:b/>
+          <w:color w:val="17365D"/>
+          <w:spacing w:val="5"/>
+          <w:kern w:val="28"/>
+          <w:sz w:val="44"/>
+          <w:szCs w:val="52"/>
+        </w:rPr>
+      </w:pPr>
+    </w:p>
+    <w:p>
+      <w:pPr>
+        <w:spacing w:after="200"/>
+        <w:rPr>
+          <w:rFonts w:asciiTheme="majorHAnsi" w:eastAsiaTheme="majorEastAsia" w:hAnsiTheme="majorHAnsi" w:cstheme="majorBidi"/>
+          <w:b/>
+          <w:color w:val="17365D"/>
+          <w:spacing w:val="5"/>
+          <w:kern w:val="28"/>
+          <w:sz w:val="44"/>
+          <w:szCs w:val="52"/>
+        </w:rPr>
+      </w:pPr>
+    </w:p>
+    <w:p>
+      <w:pPr>
+        <w:spacing w:after="200"/>
+        <w:rPr>
+          <w:rFonts w:asciiTheme="majorHAnsi" w:eastAsiaTheme="majorEastAsia" w:hAnsiTheme="majorHAnsi" w:cstheme="majorBidi"/>
+          <w:b/>
+          <w:color w:val="17365D"/>
+          <w:spacing w:val="5"/>
+          <w:kern w:val="28"/>
+          <w:sz w:val="44"/>
+          <w:szCs w:val="52"/>
+        </w:rPr>
+      </w:pPr>
+    </w:p>
+    <w:p>
+      <w:pPr>
+        <w:spacing w:after="200"/>
+        <w:rPr>
+          <w:rFonts w:asciiTheme="majorHAnsi" w:eastAsiaTheme="majorEastAsia" w:hAnsiTheme="majorHAnsi" w:cstheme="majorBidi"/>
+          <w:b/>
+          <w:color w:val="17365D"/>
+          <w:spacing w:val="5"/>
+          <w:kern w:val="28"/>
+          <w:sz w:val="44"/>
+          <w:szCs w:val="52"/>
+        </w:rPr>
+      </w:pPr>
+    </w:p>
+    <w:p>
+      <w:pPr>
+        <w:spacing w:after="200"/>
+        <w:rPr>
+          <w:rFonts w:asciiTheme="majorHAnsi" w:eastAsiaTheme="majorEastAsia" w:hAnsiTheme="majorHAnsi" w:cstheme="majorBidi"/>
+          <w:b/>
+          <w:color w:val="17365D"/>
+          <w:spacing w:val="5"/>
+          <w:kern w:val="28"/>
+          <w:sz w:val="44"/>
+          <w:szCs w:val="52"/>
+        </w:rPr>
+      </w:pPr>
+    </w:p>
+    <w:p>
+      <w:pPr>
+        <w:spacing w:after="200"/>
+        <w:rPr>
+          <w:rFonts w:asciiTheme="majorHAnsi" w:eastAsiaTheme="majorEastAsia" w:hAnsiTheme="majorHAnsi" w:cstheme="majorBidi"/>
+          <w:b/>
+          <w:color w:val="17365D"/>
+          <w:spacing w:val="5"/>
+          <w:kern w:val="28"/>
+          <w:sz w:val="44"/>
+          <w:szCs w:val="52"/>
+        </w:rPr>
+      </w:pPr>
+    </w:p>
+    <w:p>
+      <w:pPr>
+        <w:spacing w:after="200"/>
+        <w:rPr>
+          <w:rFonts w:asciiTheme="majorHAnsi" w:eastAsiaTheme="majorEastAsia" w:hAnsiTheme="majorHAnsi" w:cstheme="majorBidi"/>
+          <w:b/>
+          <w:color w:val="17365D"/>
+          <w:spacing w:val="5"/>
+          <w:kern w:val="28"/>
+          <w:sz w:val="44"/>
+          <w:szCs w:val="52"/>
+        </w:rPr>
+      </w:pPr>
+    </w:p>
+    <w:p>
+      <w:pPr>
+        <w:spacing w:after="200"/>
+        <w:rPr>
+          <w:rFonts w:asciiTheme="majorHAnsi" w:eastAsiaTheme="majorEastAsia" w:hAnsiTheme="majorHAnsi" w:cstheme="majorBidi"/>
+          <w:b/>
+          <w:color w:val="17365D"/>
+          <w:spacing w:val="5"/>
+          <w:kern w:val="28"/>
+          <w:sz w:val="44"/>
+          <w:szCs w:val="52"/>
+        </w:rPr>
+      </w:pPr>
     </w:p>
     <w:p>
       <w:pPr>
         <w:pStyle w:val="Ttulo"/>
         <w:spacing w:after="360"/>
         <w:jc w:val="center"/>
+        <w:rPr>
+          <w:rFonts w:ascii="Arial" w:eastAsiaTheme="minorHAnsi" w:hAnsi="Arial" w:cs="Arial"/>
+          <w:color w:val="auto"/>
+          <w:spacing w:val="0"/>
+          <w:kern w:val="0"/>
+          <w:sz w:val="28"/>
+          <w:szCs w:val="28"/>
+          <w:lang w:val="es-EC"/>
+        </w:rPr>
       </w:pPr>
       <w:r>
+        <w:rPr>
+          <w:rFonts w:ascii="Arial" w:eastAsiaTheme="minorHAnsi" w:hAnsi="Arial" w:cs="Arial"/>
+          <w:color w:val="auto"/>
+          <w:spacing w:val="0"/>
+          <w:kern w:val="0"/>
+          <w:sz w:val="28"/>
+          <w:szCs w:val="28"/>
+          <w:lang w:val="es-EC"/>
+        </w:rPr>
         <w:lastRenderedPageBreak/>
         <w:t>Documentación de la API REST</w:t>
       </w:r>
@@ -566,120 +1622,180 @@
     <w:p>
       <w:pPr>
         <w:pStyle w:val="Ttulo1"/>
+        <w:rPr>
+          <w:rFonts w:ascii="Arial" w:eastAsiaTheme="minorHAnsi" w:hAnsi="Arial" w:cs="Arial"/>
+          <w:bCs w:val="0"/>
+          <w:color w:val="auto"/>
+          <w:sz w:val="28"/>
+          <w:lang w:val="es-EC"/>
+        </w:rPr>
       </w:pPr>
-      <w:r>
+      <w:bookmarkStart w:id="0" w:name="_Toc235221197"/>
+      <w:r>
+        <w:rPr>
+          <w:rFonts w:ascii="Arial" w:eastAsiaTheme="minorHAnsi" w:hAnsi="Arial" w:cs="Arial"/>
+          <w:bCs w:val="0"/>
+          <w:color w:val="auto"/>
+          <w:sz w:val="28"/>
+          <w:lang w:val="es-EC"/>
+        </w:rPr>
         <w:t>Información general</w:t>
       </w:r>
+      <w:bookmarkEnd w:id="0"/>
     </w:p>
     <w:p>
       <w:pPr>
         <w:pStyle w:val="Listaconvietas"/>
+        <w:spacing w:before="240" w:line="360" w:lineRule="auto"/>
+        <w:rPr>
+          <w:rFonts w:cs="Arial"/>
+          <w:color w:val="404040"/>
+        </w:rPr>
       </w:pPr>
       <w:r>
         <w:rPr>
+          <w:rFonts w:cs="Arial"/>
           <w:b/>
+          <w:bCs/>
+          <w:color w:val="404040"/>
         </w:rPr>
         <w:t>URL local:</w:t>
       </w:r>
       <w:r>
-        <w:t xml:space="preserve"> </w:t>
-      </w:r>
-      <w:r>
-        <w:rPr>
-          <w:rFonts w:ascii="Consolas" w:hAnsi="Consolas"/>
+        <w:rPr>
+          <w:rFonts w:cs="Arial"/>
           <w:color w:val="404040"/>
-          <w:sz w:val="19"/>
-        </w:rPr>
-        <w:t>http://localhost:8000</w:t>
+        </w:rPr>
+        <w:t xml:space="preserve"> http://localhost:8000</w:t>
       </w:r>
     </w:p>
     <w:p>
       <w:pPr>
         <w:pStyle w:val="Listaconvietas"/>
+        <w:spacing w:before="240" w:line="360" w:lineRule="auto"/>
+        <w:rPr>
+          <w:rFonts w:cs="Arial"/>
+          <w:color w:val="404040"/>
+        </w:rPr>
       </w:pPr>
       <w:r>
         <w:rPr>
+          <w:rFonts w:cs="Arial"/>
           <w:b/>
+          <w:bCs/>
+          <w:color w:val="404040"/>
         </w:rPr>
         <w:t>Formato habitual:</w:t>
       </w:r>
       <w:r>
-        <w:t xml:space="preserve"> </w:t>
-      </w:r>
-      <w:r>
-        <w:rPr>
-          <w:rFonts w:ascii="Consolas" w:hAnsi="Consolas"/>
+        <w:rPr>
+          <w:rFonts w:cs="Arial"/>
           <w:color w:val="404040"/>
-          <w:sz w:val="19"/>
-        </w:rPr>
-        <w:t>application/json</w:t>
+        </w:rPr>
+        <w:t xml:space="preserve"> application/json</w:t>
       </w:r>
     </w:p>
     <w:p>
       <w:pPr>
         <w:pStyle w:val="Listaconvietas"/>
+        <w:spacing w:before="240" w:line="360" w:lineRule="auto"/>
+        <w:rPr>
+          <w:rFonts w:cs="Arial"/>
+          <w:color w:val="404040"/>
+        </w:rPr>
       </w:pPr>
       <w:r>
         <w:rPr>
+          <w:rFonts w:cs="Arial"/>
           <w:b/>
+          <w:bCs/>
+          <w:color w:val="404040"/>
         </w:rPr>
         <w:t>Carga de imagen:</w:t>
       </w:r>
       <w:r>
-        <w:t xml:space="preserve"> </w:t>
-      </w:r>
-      <w:r>
-        <w:rPr>
-          <w:rFonts w:ascii="Consolas" w:hAnsi="Consolas"/>
+        <w:rPr>
+          <w:rFonts w:cs="Arial"/>
           <w:color w:val="404040"/>
-          <w:sz w:val="19"/>
-        </w:rPr>
-        <w:t>multipart/form-data</w:t>
+        </w:rPr>
+        <w:t xml:space="preserve"> multipart/form-data</w:t>
       </w:r>
     </w:p>
     <w:p>
       <w:pPr>
         <w:pStyle w:val="Listaconvietas"/>
+        <w:spacing w:before="240" w:line="360" w:lineRule="auto"/>
+        <w:rPr>
+          <w:rFonts w:cs="Arial"/>
+          <w:color w:val="404040"/>
+        </w:rPr>
       </w:pPr>
       <w:r>
         <w:rPr>
+          <w:rFonts w:cs="Arial"/>
           <w:b/>
+          <w:bCs/>
+          <w:color w:val="404040"/>
         </w:rPr>
         <w:t>Swagger UI:</w:t>
       </w:r>
       <w:r>
-        <w:t xml:space="preserve"> </w:t>
-      </w:r>
-      <w:r>
-        <w:rPr>
-          <w:rFonts w:ascii="Consolas" w:hAnsi="Consolas"/>
+        <w:rPr>
+          <w:rFonts w:cs="Arial"/>
           <w:color w:val="404040"/>
-          <w:sz w:val="19"/>
-        </w:rPr>
-        <w:t>/docs</w:t>
+        </w:rPr>
+        <w:t xml:space="preserve"> /docs</w:t>
       </w:r>
     </w:p>
     <w:p>
       <w:pPr>
         <w:pStyle w:val="Listaconvietas"/>
+        <w:spacing w:before="240" w:line="360" w:lineRule="auto"/>
+        <w:rPr>
+          <w:rFonts w:cs="Arial"/>
+          <w:color w:val="404040"/>
+        </w:rPr>
       </w:pPr>
       <w:r>
         <w:rPr>
+          <w:rFonts w:cs="Arial"/>
           <w:b/>
+          <w:bCs/>
+          <w:color w:val="404040"/>
         </w:rPr>
         <w:t>Autenticación:</w:t>
       </w:r>
       <w:r>
+        <w:rPr>
+          <w:rFonts w:cs="Arial"/>
+          <w:color w:val="404040"/>
+        </w:rPr>
         <w:t xml:space="preserve"> no implementada</w:t>
       </w:r>
     </w:p>
     <w:p>
       <w:pPr>
         <w:pStyle w:val="Ttulo1"/>
+        <w:rPr>
+          <w:rFonts w:ascii="Arial" w:eastAsiaTheme="minorHAnsi" w:hAnsi="Arial" w:cs="Arial"/>
+          <w:bCs w:val="0"/>
+          <w:color w:val="auto"/>
+          <w:sz w:val="28"/>
+          <w:lang w:val="es-EC"/>
+        </w:rPr>
       </w:pPr>
-      <w:r>
+      <w:bookmarkStart w:id="1" w:name="_Toc235221198"/>
+      <w:r>
+        <w:rPr>
+          <w:rFonts w:ascii="Arial" w:eastAsiaTheme="minorHAnsi" w:hAnsi="Arial" w:cs="Arial"/>
+          <w:bCs w:val="0"/>
+          <w:color w:val="auto"/>
+          <w:sz w:val="28"/>
+          <w:lang w:val="es-EC"/>
+        </w:rPr>
         <w:t>Resumen de endpoints</w:t>
       </w:r>
+      <w:bookmarkEnd w:id="1"/>
     </w:p>
     <w:tbl>
       <w:tblPr>
@@ -733,8 +1849,14 @@
             <w:vAlign w:val="center"/>
           </w:tcPr>
           <w:p>
+            <w:pPr>
+              <w:rPr>
+                <w:rFonts w:cs="Arial"/>
+              </w:rPr>
+            </w:pPr>
             <w:r>
               <w:rPr>
+                <w:rFonts w:cs="Arial"/>
                 <w:b/>
                 <w:color w:val="FFFFFF"/>
               </w:rPr>
@@ -798,11 +1920,15 @@
             <w:vAlign w:val="center"/>
           </w:tcPr>
           <w:p>
+            <w:pPr>
+              <w:rPr>
+                <w:rFonts w:cs="Arial"/>
+              </w:rPr>
+            </w:pPr>
             <w:r>
               <w:rPr>
-                <w:rFonts w:ascii="Consolas" w:hAnsi="Consolas"/>
+                <w:rFonts w:cs="Arial"/>
                 <w:color w:val="404040"/>
-                <w:sz w:val="19"/>
               </w:rPr>
               <w:t>/</w:t>
             </w:r>
@@ -859,14 +1985,27 @@
             <w:vAlign w:val="center"/>
           </w:tcPr>
           <w:p>
+            <w:pPr>
+              <w:rPr>
+                <w:rFonts w:cs="Arial"/>
+              </w:rPr>
+            </w:pPr>
             <w:r>
               <w:rPr>
-                <w:rFonts w:ascii="Consolas" w:hAnsi="Consolas"/>
+                <w:rFonts w:cs="Arial"/>
                 <w:color w:val="404040"/>
-                <w:sz w:val="19"/>
               </w:rPr>
-              <w:t>/health</w:t>
+              <w:t>/</w:t>
             </w:r>
+            <w:proofErr w:type="gramStart"/>
+            <w:r>
+              <w:rPr>
+                <w:rFonts w:cs="Arial"/>
+                <w:color w:val="404040"/>
+              </w:rPr>
+              <w:t>health</w:t>
+            </w:r>
+            <w:proofErr w:type="gramEnd"/>
           </w:p>
         </w:tc>
         <w:tc>
@@ -920,14 +2059,27 @@
             <w:vAlign w:val="center"/>
           </w:tcPr>
           <w:p>
+            <w:pPr>
+              <w:rPr>
+                <w:rFonts w:cs="Arial"/>
+              </w:rPr>
+            </w:pPr>
             <w:r>
               <w:rPr>
-                <w:rFonts w:ascii="Consolas" w:hAnsi="Consolas"/>
+                <w:rFonts w:cs="Arial"/>
                 <w:color w:val="404040"/>
-                <w:sz w:val="19"/>
               </w:rPr>
-              <w:t>/status</w:t>
+              <w:t>/</w:t>
             </w:r>
+            <w:proofErr w:type="gramStart"/>
+            <w:r>
+              <w:rPr>
+                <w:rFonts w:cs="Arial"/>
+                <w:color w:val="404040"/>
+              </w:rPr>
+              <w:t>status</w:t>
+            </w:r>
+            <w:proofErr w:type="gramEnd"/>
           </w:p>
         </w:tc>
         <w:tc>
@@ -981,14 +2133,27 @@
             <w:vAlign w:val="center"/>
           </w:tcPr>
           <w:p>
+            <w:pPr>
+              <w:rPr>
+                <w:rFonts w:cs="Arial"/>
+              </w:rPr>
+            </w:pPr>
             <w:r>
               <w:rPr>
-                <w:rFonts w:ascii="Consolas" w:hAnsi="Consolas"/>
+                <w:rFonts w:cs="Arial"/>
                 <w:color w:val="404040"/>
-                <w:sz w:val="19"/>
               </w:rPr>
-              <w:t>/config</w:t>
+              <w:t>/</w:t>
             </w:r>
+            <w:proofErr w:type="gramStart"/>
+            <w:r>
+              <w:rPr>
+                <w:rFonts w:cs="Arial"/>
+                <w:color w:val="404040"/>
+              </w:rPr>
+              <w:t>config</w:t>
+            </w:r>
+            <w:proofErr w:type="gramEnd"/>
           </w:p>
         </w:tc>
         <w:tc>
@@ -1042,14 +2207,27 @@
             <w:vAlign w:val="center"/>
           </w:tcPr>
           <w:p>
+            <w:pPr>
+              <w:rPr>
+                <w:rFonts w:cs="Arial"/>
+              </w:rPr>
+            </w:pPr>
             <w:r>
               <w:rPr>
-                <w:rFonts w:ascii="Consolas" w:hAnsi="Consolas"/>
+                <w:rFonts w:cs="Arial"/>
                 <w:color w:val="404040"/>
-                <w:sz w:val="19"/>
               </w:rPr>
-              <w:t>/config</w:t>
+              <w:t>/</w:t>
             </w:r>
+            <w:proofErr w:type="gramStart"/>
+            <w:r>
+              <w:rPr>
+                <w:rFonts w:cs="Arial"/>
+                <w:color w:val="404040"/>
+              </w:rPr>
+              <w:t>config</w:t>
+            </w:r>
+            <w:proofErr w:type="gramEnd"/>
           </w:p>
         </w:tc>
         <w:tc>
@@ -1103,14 +2281,27 @@
             <w:vAlign w:val="center"/>
           </w:tcPr>
           <w:p>
+            <w:pPr>
+              <w:rPr>
+                <w:rFonts w:cs="Arial"/>
+              </w:rPr>
+            </w:pPr>
             <w:r>
               <w:rPr>
-                <w:rFonts w:ascii="Consolas" w:hAnsi="Consolas"/>
+                <w:rFonts w:cs="Arial"/>
                 <w:color w:val="404040"/>
-                <w:sz w:val="19"/>
               </w:rPr>
-              <w:t>/train</w:t>
+              <w:t>/</w:t>
             </w:r>
+            <w:proofErr w:type="gramStart"/>
+            <w:r>
+              <w:rPr>
+                <w:rFonts w:cs="Arial"/>
+                <w:color w:val="404040"/>
+              </w:rPr>
+              <w:t>train</w:t>
+            </w:r>
+            <w:proofErr w:type="gramEnd"/>
           </w:p>
         </w:tc>
         <w:tc>
@@ -1164,14 +2355,27 @@
             <w:vAlign w:val="center"/>
           </w:tcPr>
           <w:p>
+            <w:pPr>
+              <w:rPr>
+                <w:rFonts w:cs="Arial"/>
+              </w:rPr>
+            </w:pPr>
             <w:r>
               <w:rPr>
-                <w:rFonts w:ascii="Consolas" w:hAnsi="Consolas"/>
+                <w:rFonts w:cs="Arial"/>
                 <w:color w:val="404040"/>
-                <w:sz w:val="19"/>
               </w:rPr>
-              <w:t>/metrics</w:t>
+              <w:t>/</w:t>
             </w:r>
+            <w:proofErr w:type="gramStart"/>
+            <w:r>
+              <w:rPr>
+                <w:rFonts w:cs="Arial"/>
+                <w:color w:val="404040"/>
+              </w:rPr>
+              <w:t>metrics</w:t>
+            </w:r>
+            <w:proofErr w:type="gramEnd"/>
           </w:p>
         </w:tc>
         <w:tc>
@@ -1225,14 +2429,27 @@
             <w:vAlign w:val="center"/>
           </w:tcPr>
           <w:p>
+            <w:pPr>
+              <w:rPr>
+                <w:rFonts w:cs="Arial"/>
+              </w:rPr>
+            </w:pPr>
             <w:r>
               <w:rPr>
-                <w:rFonts w:ascii="Consolas" w:hAnsi="Consolas"/>
+                <w:rFonts w:cs="Arial"/>
                 <w:color w:val="404040"/>
-                <w:sz w:val="19"/>
               </w:rPr>
-              <w:t>/predict</w:t>
+              <w:t>/</w:t>
             </w:r>
+            <w:proofErr w:type="gramStart"/>
+            <w:r>
+              <w:rPr>
+                <w:rFonts w:cs="Arial"/>
+                <w:color w:val="404040"/>
+              </w:rPr>
+              <w:t>predict</w:t>
+            </w:r>
+            <w:proofErr w:type="gramEnd"/>
           </w:p>
         </w:tc>
         <w:tc>
@@ -1262,10 +2479,26 @@
     <w:p>
       <w:pPr>
         <w:pStyle w:val="Ttulo1"/>
+        <w:rPr>
+          <w:rFonts w:ascii="Arial" w:eastAsiaTheme="minorHAnsi" w:hAnsi="Arial" w:cs="Arial"/>
+          <w:bCs w:val="0"/>
+          <w:color w:val="auto"/>
+          <w:sz w:val="28"/>
+          <w:lang w:val="es-EC"/>
+        </w:rPr>
       </w:pPr>
-      <w:r>
+      <w:bookmarkStart w:id="2" w:name="_Toc235221199"/>
+      <w:r>
+        <w:rPr>
+          <w:rFonts w:ascii="Arial" w:eastAsiaTheme="minorHAnsi" w:hAnsi="Arial" w:cs="Arial"/>
+          <w:bCs w:val="0"/>
+          <w:color w:val="auto"/>
+          <w:sz w:val="28"/>
+          <w:lang w:val="es-EC"/>
+        </w:rPr>
         <w:t>`GET /`</w:t>
       </w:r>
+      <w:bookmarkEnd w:id="2"/>
     </w:p>
     <w:p>
       <w:pPr>
@@ -1324,13 +2557,30 @@
     <w:p>
       <w:pPr>
         <w:pStyle w:val="Ttulo1"/>
+        <w:rPr>
+          <w:rFonts w:ascii="Arial" w:eastAsiaTheme="minorHAnsi" w:hAnsi="Arial" w:cs="Arial"/>
+          <w:bCs w:val="0"/>
+          <w:color w:val="auto"/>
+          <w:sz w:val="28"/>
+          <w:lang w:val="es-EC"/>
+        </w:rPr>
       </w:pPr>
-      <w:r>
+      <w:bookmarkStart w:id="3" w:name="_Toc235221200"/>
+      <w:r>
+        <w:rPr>
+          <w:rFonts w:ascii="Arial" w:eastAsiaTheme="minorHAnsi" w:hAnsi="Arial" w:cs="Arial"/>
+          <w:bCs w:val="0"/>
+          <w:color w:val="auto"/>
+          <w:sz w:val="28"/>
+          <w:lang w:val="es-EC"/>
+        </w:rPr>
         <w:t>`GET /health`</w:t>
       </w:r>
+      <w:bookmarkEnd w:id="3"/>
     </w:p>
     <w:p>
       <w:pPr>
+        <w:spacing w:line="360" w:lineRule="auto"/>
         <w:jc w:val="both"/>
       </w:pPr>
       <w:r>
@@ -1365,13 +2615,30 @@
     <w:p>
       <w:pPr>
         <w:pStyle w:val="Ttulo1"/>
+        <w:rPr>
+          <w:rFonts w:ascii="Arial" w:eastAsiaTheme="minorHAnsi" w:hAnsi="Arial" w:cs="Arial"/>
+          <w:bCs w:val="0"/>
+          <w:color w:val="auto"/>
+          <w:sz w:val="28"/>
+          <w:lang w:val="es-EC"/>
+        </w:rPr>
       </w:pPr>
-      <w:r>
+      <w:bookmarkStart w:id="4" w:name="_Toc235221201"/>
+      <w:r>
+        <w:rPr>
+          <w:rFonts w:ascii="Arial" w:eastAsiaTheme="minorHAnsi" w:hAnsi="Arial" w:cs="Arial"/>
+          <w:bCs w:val="0"/>
+          <w:color w:val="auto"/>
+          <w:sz w:val="28"/>
+          <w:lang w:val="es-EC"/>
+        </w:rPr>
         <w:t>`GET /status`</w:t>
       </w:r>
+      <w:bookmarkEnd w:id="4"/>
     </w:p>
     <w:p>
       <w:pPr>
+        <w:spacing w:line="360" w:lineRule="auto"/>
         <w:jc w:val="both"/>
       </w:pPr>
       <w:r>
@@ -1438,10 +2705,40 @@
     </w:p>
     <w:p>
       <w:pPr>
+        <w:spacing w:line="360" w:lineRule="auto"/>
         <w:jc w:val="both"/>
       </w:pPr>
-      <w:r>
-        <w:t xml:space="preserve">Cuando el archivo existe, ambos indicadores son </w:t>
+      <w:proofErr w:type="spellStart"/>
+      <w:r>
+        <w:t>Cuando</w:t>
+      </w:r>
+      <w:proofErr w:type="spellEnd"/>
+      <w:r>
+        <w:t xml:space="preserve"> </w:t>
+      </w:r>
+      <w:proofErr w:type="spellStart"/>
+      <w:r>
+        <w:t>el</w:t>
+      </w:r>
+      <w:proofErr w:type="spellEnd"/>
+      <w:r>
+        <w:t xml:space="preserve"> </w:t>
+      </w:r>
+      <w:proofErr w:type="spellStart"/>
+      <w:r>
+        <w:t>archivo</w:t>
+      </w:r>
+      <w:proofErr w:type="spellEnd"/>
+      <w:r>
+        <w:t xml:space="preserve"> </w:t>
+      </w:r>
+      <w:proofErr w:type="spellStart"/>
+      <w:r>
+        <w:t>existe</w:t>
+      </w:r>
+      <w:proofErr w:type="spellEnd"/>
+      <w:r>
+        <w:t xml:space="preserve">, ambos indicadores son </w:t>
       </w:r>
       <w:r>
         <w:rPr>
@@ -1480,10 +2777,48 @@
     <w:p>
       <w:pPr>
         <w:pStyle w:val="Ttulo1"/>
+        <w:rPr>
+          <w:rFonts w:ascii="Arial" w:eastAsiaTheme="minorHAnsi" w:hAnsi="Arial" w:cs="Arial"/>
+          <w:bCs w:val="0"/>
+          <w:color w:val="auto"/>
+          <w:sz w:val="28"/>
+          <w:lang w:val="es-EC"/>
+        </w:rPr>
       </w:pPr>
-      <w:r>
-        <w:t>`GET /config`</w:t>
-      </w:r>
+      <w:bookmarkStart w:id="5" w:name="_Toc235221202"/>
+      <w:r>
+        <w:rPr>
+          <w:rFonts w:ascii="Arial" w:eastAsiaTheme="minorHAnsi" w:hAnsi="Arial" w:cs="Arial"/>
+          <w:bCs w:val="0"/>
+          <w:color w:val="auto"/>
+          <w:sz w:val="28"/>
+          <w:lang w:val="es-EC"/>
+        </w:rPr>
+        <w:t>`GET /</w:t>
+      </w:r>
+      <w:proofErr w:type="spellStart"/>
+      <w:r>
+        <w:rPr>
+          <w:rFonts w:ascii="Arial" w:eastAsiaTheme="minorHAnsi" w:hAnsi="Arial" w:cs="Arial"/>
+          <w:bCs w:val="0"/>
+          <w:color w:val="auto"/>
+          <w:sz w:val="28"/>
+          <w:lang w:val="es-EC"/>
+        </w:rPr>
+        <w:t>config</w:t>
+      </w:r>
+      <w:proofErr w:type="spellEnd"/>
+      <w:r>
+        <w:rPr>
+          <w:rFonts w:ascii="Arial" w:eastAsiaTheme="minorHAnsi" w:hAnsi="Arial" w:cs="Arial"/>
+          <w:bCs w:val="0"/>
+          <w:color w:val="auto"/>
+          <w:sz w:val="28"/>
+          <w:lang w:val="es-EC"/>
+        </w:rPr>
+        <w:t>`</w:t>
+      </w:r>
+      <w:bookmarkEnd w:id="5"/>
     </w:p>
     <w:p>
       <w:pPr>
@@ -1558,13 +2893,30 @@
     <w:p>
       <w:pPr>
         <w:pStyle w:val="Ttulo1"/>
+        <w:rPr>
+          <w:rFonts w:ascii="Arial" w:eastAsiaTheme="minorHAnsi" w:hAnsi="Arial" w:cs="Arial"/>
+          <w:bCs w:val="0"/>
+          <w:color w:val="auto"/>
+          <w:sz w:val="28"/>
+          <w:lang w:val="es-EC"/>
+        </w:rPr>
       </w:pPr>
-      <w:r>
+      <w:bookmarkStart w:id="6" w:name="_Toc235221203"/>
+      <w:r>
+        <w:rPr>
+          <w:rFonts w:ascii="Arial" w:eastAsiaTheme="minorHAnsi" w:hAnsi="Arial" w:cs="Arial"/>
+          <w:bCs w:val="0"/>
+          <w:color w:val="auto"/>
+          <w:sz w:val="28"/>
+          <w:lang w:val="es-EC"/>
+        </w:rPr>
         <w:t>`POST /config`</w:t>
       </w:r>
+      <w:bookmarkEnd w:id="6"/>
     </w:p>
     <w:p>
       <w:pPr>
+        <w:spacing w:line="360" w:lineRule="auto"/>
         <w:jc w:val="both"/>
       </w:pPr>
       <w:r>
@@ -1635,6 +2987,7 @@
     </w:p>
     <w:p>
       <w:pPr>
+        <w:spacing w:line="360" w:lineRule="auto"/>
         <w:jc w:val="both"/>
       </w:pPr>
       <w:r>
@@ -1748,6 +3101,7 @@
     </w:p>
     <w:p>
       <w:pPr>
+        <w:spacing w:line="360" w:lineRule="auto"/>
         <w:jc w:val="both"/>
       </w:pPr>
       <w:r>
@@ -1767,6 +3121,7 @@
     </w:p>
     <w:p>
       <w:pPr>
+        <w:spacing w:line="360" w:lineRule="auto"/>
         <w:jc w:val="both"/>
       </w:pPr>
       <w:r>
@@ -1806,13 +3161,31 @@
     <w:p>
       <w:pPr>
         <w:pStyle w:val="Ttulo1"/>
+        <w:rPr>
+          <w:rFonts w:ascii="Arial" w:eastAsiaTheme="minorHAnsi" w:hAnsi="Arial" w:cs="Arial"/>
+          <w:bCs w:val="0"/>
+          <w:color w:val="auto"/>
+          <w:sz w:val="28"/>
+          <w:lang w:val="es-EC"/>
+        </w:rPr>
       </w:pPr>
-      <w:r>
+      <w:bookmarkStart w:id="7" w:name="_Toc235221204"/>
+      <w:r>
+        <w:rPr>
+          <w:rFonts w:ascii="Arial" w:eastAsiaTheme="minorHAnsi" w:hAnsi="Arial" w:cs="Arial"/>
+          <w:bCs w:val="0"/>
+          <w:color w:val="auto"/>
+          <w:sz w:val="28"/>
+          <w:lang w:val="es-EC"/>
+        </w:rPr>
+        <w:lastRenderedPageBreak/>
         <w:t>`POST /train`</w:t>
       </w:r>
+      <w:bookmarkEnd w:id="7"/>
     </w:p>
     <w:p>
       <w:pPr>
+        <w:spacing w:line="360" w:lineRule="auto"/>
         <w:jc w:val="both"/>
       </w:pPr>
       <w:r>
@@ -1821,10 +3194,10 @@
     </w:p>
     <w:p>
       <w:pPr>
+        <w:spacing w:line="360" w:lineRule="auto"/>
         <w:jc w:val="both"/>
       </w:pPr>
       <w:r>
-        <w:lastRenderedPageBreak/>
         <w:t xml:space="preserve">Respuesta </w:t>
       </w:r>
       <w:r>
@@ -1935,10 +3308,18 @@
     </w:p>
     <w:p>
       <w:pPr>
+        <w:spacing w:line="360" w:lineRule="auto"/>
         <w:jc w:val="both"/>
       </w:pPr>
       <w:r>
-        <w:t xml:space="preserve">Un error de descarga, TensorFlow o escritura responde </w:t>
+        <w:rPr>
+          <w:rFonts w:eastAsiaTheme="minorHAnsi" w:cs="Arial"/>
+          <w:lang w:val="es-EC"/>
+        </w:rPr>
+        <w:t>Un error de descarga, TensorFlow o escritura responde 500 con</w:t>
+      </w:r>
+      <w:r>
+        <w:t xml:space="preserve"> </w:t>
       </w:r>
       <w:r>
         <w:rPr>
@@ -1946,18 +3327,25 @@
           <w:color w:val="404040"/>
           <w:sz w:val="19"/>
         </w:rPr>
-        <w:t>500</w:t>
-      </w:r>
-      <w:r>
-        <w:t xml:space="preserve"> con </w:t>
-      </w:r>
+        <w:t>{"detail</w:t>
+      </w:r>
+      <w:proofErr w:type="gramStart"/>
       <w:r>
         <w:rPr>
           <w:rFonts w:ascii="Consolas" w:hAnsi="Consolas"/>
           <w:color w:val="404040"/>
           <w:sz w:val="19"/>
         </w:rPr>
-        <w:t>{"detail":"..."}</w:t>
+        <w:t>":"..."</w:t>
+      </w:r>
+      <w:proofErr w:type="gramEnd"/>
+      <w:r>
+        <w:rPr>
+          <w:rFonts w:ascii="Consolas" w:hAnsi="Consolas"/>
+          <w:color w:val="404040"/>
+          <w:sz w:val="19"/>
+        </w:rPr>
+        <w:t>}</w:t>
       </w:r>
       <w:r>
         <w:t>.</w:t>
@@ -1966,14 +3354,30 @@
     <w:p>
       <w:pPr>
         <w:pStyle w:val="Ttulo1"/>
+        <w:rPr>
+          <w:rFonts w:ascii="Arial" w:eastAsiaTheme="minorHAnsi" w:hAnsi="Arial" w:cs="Arial"/>
+          <w:bCs w:val="0"/>
+          <w:color w:val="auto"/>
+          <w:sz w:val="28"/>
+          <w:lang w:val="es-EC"/>
+        </w:rPr>
       </w:pPr>
-      <w:r>
+      <w:bookmarkStart w:id="8" w:name="_Toc235221205"/>
+      <w:r>
+        <w:rPr>
+          <w:rFonts w:ascii="Arial" w:eastAsiaTheme="minorHAnsi" w:hAnsi="Arial" w:cs="Arial"/>
+          <w:bCs w:val="0"/>
+          <w:color w:val="auto"/>
+          <w:sz w:val="28"/>
+          <w:lang w:val="es-EC"/>
+        </w:rPr>
         <w:t>`GET /metrics`</w:t>
       </w:r>
+      <w:bookmarkEnd w:id="8"/>
     </w:p>
     <w:p>
       <w:pPr>
-        <w:jc w:val="both"/>
+        <w:pStyle w:val="Texto"/>
       </w:pPr>
       <w:r>
         <w:t>Devuelve el historial completo de la última ejecución:</w:t>
@@ -2099,10 +3503,18 @@
     </w:p>
     <w:p>
       <w:pPr>
+        <w:spacing w:line="360" w:lineRule="auto"/>
         <w:jc w:val="both"/>
       </w:pPr>
       <w:r>
-        <w:t xml:space="preserve">Si no existe el historial, responde </w:t>
+        <w:rPr>
+          <w:rFonts w:eastAsiaTheme="minorHAnsi" w:cs="Arial"/>
+          <w:lang w:val="es-EC"/>
+        </w:rPr>
+        <w:t>Si no existe el historial, responde</w:t>
+      </w:r>
+      <w:r>
+        <w:t xml:space="preserve"> </w:t>
       </w:r>
       <w:r>
         <w:rPr>
@@ -2133,17 +3545,41 @@
     <w:p>
       <w:pPr>
         <w:pStyle w:val="Ttulo1"/>
+        <w:rPr>
+          <w:rFonts w:ascii="Arial" w:eastAsiaTheme="minorHAnsi" w:hAnsi="Arial" w:cs="Arial"/>
+          <w:bCs w:val="0"/>
+          <w:color w:val="auto"/>
+          <w:sz w:val="28"/>
+          <w:lang w:val="es-EC"/>
+        </w:rPr>
       </w:pPr>
-      <w:r>
+      <w:bookmarkStart w:id="9" w:name="_Toc235221206"/>
+      <w:r>
+        <w:rPr>
+          <w:rFonts w:ascii="Arial" w:eastAsiaTheme="minorHAnsi" w:hAnsi="Arial" w:cs="Arial"/>
+          <w:bCs w:val="0"/>
+          <w:color w:val="auto"/>
+          <w:sz w:val="28"/>
+          <w:lang w:val="es-EC"/>
+        </w:rPr>
         <w:t>`POST /predict`</w:t>
       </w:r>
+      <w:bookmarkEnd w:id="9"/>
     </w:p>
     <w:p>
       <w:pPr>
+        <w:spacing w:line="360" w:lineRule="auto"/>
         <w:jc w:val="both"/>
       </w:pPr>
       <w:r>
-        <w:t xml:space="preserve">Recibe el campo </w:t>
+        <w:rPr>
+          <w:rFonts w:eastAsiaTheme="minorHAnsi" w:cs="Arial"/>
+          <w:lang w:val="es-EC"/>
+        </w:rPr>
+        <w:t>Recibe el campo</w:t>
+      </w:r>
+      <w:r>
+        <w:t xml:space="preserve"> </w:t>
       </w:r>
       <w:r>
         <w:rPr>
@@ -2154,7 +3590,14 @@
         <w:t>file</w:t>
       </w:r>
       <w:r>
-        <w:t xml:space="preserve"> como imagen multipart. Requiere un modelo guardado.</w:t>
+        <w:t xml:space="preserve"> </w:t>
+      </w:r>
+      <w:r>
+        <w:rPr>
+          <w:rFonts w:eastAsiaTheme="minorHAnsi" w:cs="Arial"/>
+          <w:lang w:val="es-EC"/>
+        </w:rPr>
+        <w:t>como imagen multipart. Requiere un modelo guardado.</w:t>
       </w:r>
     </w:p>
     <w:p>
@@ -2181,9 +3624,14 @@
     </w:p>
     <w:p>
       <w:pPr>
+        <w:spacing w:line="360" w:lineRule="auto"/>
         <w:jc w:val="both"/>
       </w:pPr>
       <w:r>
+        <w:rPr>
+          <w:rFonts w:eastAsiaTheme="minorHAnsi" w:cs="Arial"/>
+          <w:lang w:val="es-EC"/>
+        </w:rPr>
         <w:t xml:space="preserve">Respuesta </w:t>
       </w:r>
       <w:r>
@@ -2195,7 +3643,14 @@
         <w:t>200</w:t>
       </w:r>
       <w:r>
-        <w:t xml:space="preserve"> (valores ilustrativos):</w:t>
+        <w:t xml:space="preserve"> </w:t>
+      </w:r>
+      <w:r>
+        <w:rPr>
+          <w:rFonts w:eastAsiaTheme="minorHAnsi" w:cs="Arial"/>
+          <w:lang w:val="es-EC"/>
+        </w:rPr>
+        <w:t>(valores ilustrativos):</w:t>
       </w:r>
     </w:p>
     <w:p>
@@ -2273,13 +3728,20 @@
           <w:sz w:val="17"/>
         </w:rPr>
         <w:br/>
-        <w:t xml:space="preserve">    "Vestido": 0.03,</w:t>
       </w:r>
       <w:r>
         <w:rPr>
           <w:rFonts w:ascii="Consolas" w:hAnsi="Consolas"/>
           <w:sz w:val="17"/>
         </w:rPr>
+        <w:lastRenderedPageBreak/>
+        <w:t xml:space="preserve">    "Vestido": 0.03,</w:t>
+      </w:r>
+      <w:r>
+        <w:rPr>
+          <w:rFonts w:ascii="Consolas" w:hAnsi="Consolas"/>
+          <w:sz w:val="17"/>
+        </w:rPr>
         <w:br/>
         <w:t xml:space="preserve">    "Abrigo": 3.96,</w:t>
       </w:r>
@@ -2329,13 +3791,6 @@
           <w:sz w:val="17"/>
         </w:rPr>
         <w:br/>
-      </w:r>
-      <w:r>
-        <w:rPr>
-          <w:rFonts w:ascii="Consolas" w:hAnsi="Consolas"/>
-          <w:sz w:val="17"/>
-        </w:rPr>
-        <w:lastRenderedPageBreak/>
         <w:t xml:space="preserve">  }</w:t>
       </w:r>
       <w:r>
@@ -2349,20 +3804,200 @@
     </w:p>
     <w:p>
       <w:pPr>
-        <w:shd w:val="clear" w:color="auto" w:fill="D9EAF7"/>
-        <w:ind w:left="397" w:right="227"/>
+        <w:spacing w:line="360" w:lineRule="auto"/>
+        <w:ind w:left="283"/>
+        <w:rPr>
+          <w:i/>
+          <w:iCs/>
+        </w:rPr>
       </w:pPr>
       <w:r>
         <w:rPr>
           <w:i/>
-          <w:color w:val="404040"/>
-        </w:rPr>
-        <w:t>Los valores anteriores solo ilustran el contrato; no representan una predicción verificada para el archivo incluido.</w:t>
+          <w:iCs/>
+        </w:rPr>
+        <w:t xml:space="preserve">Los </w:t>
+      </w:r>
+      <w:proofErr w:type="spellStart"/>
+      <w:r>
+        <w:rPr>
+          <w:i/>
+          <w:iCs/>
+        </w:rPr>
+        <w:t>valores</w:t>
+      </w:r>
+      <w:proofErr w:type="spellEnd"/>
+      <w:r>
+        <w:rPr>
+          <w:i/>
+          <w:iCs/>
+        </w:rPr>
+        <w:t xml:space="preserve"> </w:t>
+      </w:r>
+      <w:proofErr w:type="spellStart"/>
+      <w:r>
+        <w:rPr>
+          <w:i/>
+          <w:iCs/>
+        </w:rPr>
+        <w:t>anteriores</w:t>
+      </w:r>
+      <w:proofErr w:type="spellEnd"/>
+      <w:r>
+        <w:rPr>
+          <w:i/>
+          <w:iCs/>
+        </w:rPr>
+        <w:t xml:space="preserve"> solo </w:t>
+      </w:r>
+      <w:proofErr w:type="spellStart"/>
+      <w:r>
+        <w:rPr>
+          <w:i/>
+          <w:iCs/>
+        </w:rPr>
+        <w:t>ilustran</w:t>
+      </w:r>
+      <w:proofErr w:type="spellEnd"/>
+      <w:r>
+        <w:rPr>
+          <w:i/>
+          <w:iCs/>
+        </w:rPr>
+        <w:t xml:space="preserve"> </w:t>
+      </w:r>
+      <w:proofErr w:type="spellStart"/>
+      <w:r>
+        <w:rPr>
+          <w:i/>
+          <w:iCs/>
+        </w:rPr>
+        <w:t>el</w:t>
+      </w:r>
+      <w:proofErr w:type="spellEnd"/>
+      <w:r>
+        <w:rPr>
+          <w:i/>
+          <w:iCs/>
+        </w:rPr>
+        <w:t xml:space="preserve"> </w:t>
+      </w:r>
+      <w:proofErr w:type="spellStart"/>
+      <w:r>
+        <w:rPr>
+          <w:i/>
+          <w:iCs/>
+        </w:rPr>
+        <w:t>contrato</w:t>
+      </w:r>
+      <w:proofErr w:type="spellEnd"/>
+      <w:r>
+        <w:rPr>
+          <w:i/>
+          <w:iCs/>
+        </w:rPr>
+        <w:t xml:space="preserve">; no </w:t>
+      </w:r>
+      <w:proofErr w:type="spellStart"/>
+      <w:r>
+        <w:rPr>
+          <w:i/>
+          <w:iCs/>
+        </w:rPr>
+        <w:t>representan</w:t>
+      </w:r>
+      <w:proofErr w:type="spellEnd"/>
+      <w:r>
+        <w:rPr>
+          <w:i/>
+          <w:iCs/>
+        </w:rPr>
+        <w:t xml:space="preserve"> una </w:t>
+      </w:r>
+      <w:proofErr w:type="spellStart"/>
+      <w:r>
+        <w:rPr>
+          <w:i/>
+          <w:iCs/>
+        </w:rPr>
+        <w:t>predicción</w:t>
+      </w:r>
+      <w:proofErr w:type="spellEnd"/>
+      <w:r>
+        <w:rPr>
+          <w:i/>
+          <w:iCs/>
+        </w:rPr>
+        <w:t xml:space="preserve"> </w:t>
+      </w:r>
+      <w:proofErr w:type="spellStart"/>
+      <w:r>
+        <w:rPr>
+          <w:i/>
+          <w:iCs/>
+        </w:rPr>
+        <w:t>verificada</w:t>
+      </w:r>
+      <w:proofErr w:type="spellEnd"/>
+      <w:r>
+        <w:rPr>
+          <w:i/>
+          <w:iCs/>
+        </w:rPr>
+        <w:t xml:space="preserve"> para </w:t>
+      </w:r>
+      <w:proofErr w:type="spellStart"/>
+      <w:r>
+        <w:rPr>
+          <w:i/>
+          <w:iCs/>
+        </w:rPr>
+        <w:t>el</w:t>
+      </w:r>
+      <w:proofErr w:type="spellEnd"/>
+      <w:r>
+        <w:rPr>
+          <w:i/>
+          <w:iCs/>
+        </w:rPr>
+        <w:t xml:space="preserve"> </w:t>
+      </w:r>
+      <w:proofErr w:type="spellStart"/>
+      <w:r>
+        <w:rPr>
+          <w:i/>
+          <w:iCs/>
+        </w:rPr>
+        <w:t>archivo</w:t>
+      </w:r>
+      <w:proofErr w:type="spellEnd"/>
+      <w:r>
+        <w:rPr>
+          <w:i/>
+          <w:iCs/>
+        </w:rPr>
+        <w:t xml:space="preserve"> </w:t>
+      </w:r>
+      <w:proofErr w:type="spellStart"/>
+      <w:r>
+        <w:rPr>
+          <w:i/>
+          <w:iCs/>
+        </w:rPr>
+        <w:t>incluido</w:t>
+      </w:r>
+      <w:proofErr w:type="spellEnd"/>
+      <w:r>
+        <w:rPr>
+          <w:i/>
+          <w:iCs/>
+        </w:rPr>
+        <w:t>.</w:t>
       </w:r>
     </w:p>
     <w:p>
       <w:pPr>
-        <w:jc w:val="both"/>
+        <w:pStyle w:val="Texto"/>
       </w:pPr>
       <w:r>
         <w:t>Errores principales:</w:t>
@@ -2371,69 +4006,168 @@
     <w:p>
       <w:pPr>
         <w:pStyle w:val="Listaconvietas"/>
+        <w:spacing w:before="240" w:line="360" w:lineRule="auto"/>
+        <w:rPr>
+          <w:rFonts w:cs="Arial"/>
+        </w:rPr>
       </w:pPr>
       <w:r>
         <w:rPr>
-          <w:rFonts w:ascii="Consolas" w:hAnsi="Consolas"/>
+          <w:rFonts w:cs="Arial"/>
           <w:color w:val="404040"/>
-          <w:sz w:val="19"/>
         </w:rPr>
         <w:t>400</w:t>
       </w:r>
       <w:r>
-        <w:t>: no existe un modelo entrenado.</w:t>
+        <w:rPr>
+          <w:rFonts w:cs="Arial"/>
+        </w:rPr>
+        <w:t xml:space="preserve">: </w:t>
+      </w:r>
+      <w:r>
+        <w:rPr>
+          <w:rFonts w:eastAsiaTheme="minorHAnsi" w:cs="Arial"/>
+          <w:lang w:val="es-EC"/>
+        </w:rPr>
+        <w:t>no existe un modelo entrenado.</w:t>
       </w:r>
     </w:p>
     <w:p>
       <w:pPr>
         <w:pStyle w:val="Listaconvietas"/>
+        <w:spacing w:before="240" w:line="360" w:lineRule="auto"/>
+        <w:rPr>
+          <w:rFonts w:cs="Arial"/>
+        </w:rPr>
       </w:pPr>
       <w:r>
         <w:rPr>
-          <w:rFonts w:ascii="Consolas" w:hAnsi="Consolas"/>
+          <w:rFonts w:cs="Arial"/>
           <w:color w:val="404040"/>
-          <w:sz w:val="19"/>
         </w:rPr>
         <w:t>422</w:t>
       </w:r>
       <w:r>
-        <w:t xml:space="preserve">: falta el campo </w:t>
-      </w:r>
-      <w:r>
-        <w:rPr>
-          <w:rFonts w:ascii="Consolas" w:hAnsi="Consolas"/>
+        <w:rPr>
+          <w:rFonts w:cs="Arial"/>
+        </w:rPr>
+        <w:t xml:space="preserve">: </w:t>
+      </w:r>
+      <w:proofErr w:type="spellStart"/>
+      <w:r>
+        <w:rPr>
+          <w:rFonts w:cs="Arial"/>
+        </w:rPr>
+        <w:t>falta</w:t>
+      </w:r>
+      <w:proofErr w:type="spellEnd"/>
+      <w:r>
+        <w:rPr>
+          <w:rFonts w:cs="Arial"/>
+        </w:rPr>
+        <w:t xml:space="preserve"> </w:t>
+      </w:r>
+      <w:proofErr w:type="spellStart"/>
+      <w:r>
+        <w:rPr>
+          <w:rFonts w:cs="Arial"/>
+        </w:rPr>
+        <w:t>el</w:t>
+      </w:r>
+      <w:proofErr w:type="spellEnd"/>
+      <w:r>
+        <w:rPr>
+          <w:rFonts w:cs="Arial"/>
+        </w:rPr>
+        <w:t xml:space="preserve"> campo </w:t>
+      </w:r>
+      <w:r>
+        <w:rPr>
+          <w:rFonts w:cs="Arial"/>
           <w:color w:val="404040"/>
-          <w:sz w:val="19"/>
         </w:rPr>
         <w:t>file</w:t>
       </w:r>
       <w:r>
+        <w:rPr>
+          <w:rFonts w:cs="Arial"/>
+        </w:rPr>
         <w:t>.</w:t>
       </w:r>
     </w:p>
     <w:p>
       <w:pPr>
         <w:pStyle w:val="Listaconvietas"/>
+        <w:spacing w:before="240" w:line="360" w:lineRule="auto"/>
+        <w:rPr>
+          <w:rFonts w:cs="Arial"/>
+        </w:rPr>
       </w:pPr>
       <w:r>
         <w:rPr>
-          <w:rFonts w:ascii="Consolas" w:hAnsi="Consolas"/>
+          <w:rFonts w:cs="Arial"/>
           <w:color w:val="404040"/>
-          <w:sz w:val="19"/>
         </w:rPr>
         <w:t>500</w:t>
       </w:r>
       <w:r>
-        <w:t>: imagen inválida, modelo incompatible o error de inferencia.</w:t>
+        <w:rPr>
+          <w:rFonts w:cs="Arial"/>
+        </w:rPr>
+        <w:t xml:space="preserve">: imagen </w:t>
+      </w:r>
+      <w:proofErr w:type="spellStart"/>
+      <w:r>
+        <w:rPr>
+          <w:rFonts w:cs="Arial"/>
+        </w:rPr>
+        <w:t>inválida</w:t>
+      </w:r>
+      <w:proofErr w:type="spellEnd"/>
+      <w:r>
+        <w:rPr>
+          <w:rFonts w:cs="Arial"/>
+        </w:rPr>
+        <w:t xml:space="preserve">, </w:t>
+      </w:r>
+      <w:proofErr w:type="spellStart"/>
+      <w:r>
+        <w:rPr>
+          <w:rFonts w:cs="Arial"/>
+        </w:rPr>
+        <w:t>modelo</w:t>
+      </w:r>
+      <w:proofErr w:type="spellEnd"/>
+      <w:r>
+        <w:rPr>
+          <w:rFonts w:cs="Arial"/>
+        </w:rPr>
+        <w:t xml:space="preserve"> incompatible o error de inferencia.</w:t>
       </w:r>
     </w:p>
     <w:p>
       <w:pPr>
         <w:pStyle w:val="Ttulo1"/>
+        <w:rPr>
+          <w:rFonts w:ascii="Arial" w:eastAsiaTheme="minorHAnsi" w:hAnsi="Arial" w:cs="Arial"/>
+          <w:bCs w:val="0"/>
+          <w:color w:val="auto"/>
+          <w:sz w:val="28"/>
+          <w:lang w:val="es-EC"/>
+        </w:rPr>
       </w:pPr>
-      <w:r>
+      <w:bookmarkStart w:id="10" w:name="_Toc235221207"/>
+      <w:r>
+        <w:rPr>
+          <w:rFonts w:ascii="Arial" w:eastAsiaTheme="minorHAnsi" w:hAnsi="Arial" w:cs="Arial"/>
+          <w:bCs w:val="0"/>
+          <w:color w:val="auto"/>
+          <w:sz w:val="28"/>
+          <w:lang w:val="es-EC"/>
+        </w:rPr>
         <w:t>Códigos HTTP</w:t>
       </w:r>
+      <w:bookmarkEnd w:id="10"/>
     </w:p>
     <w:tbl>
       <w:tblPr>
@@ -2700,14 +4434,31 @@
     <w:p>
       <w:pPr>
         <w:pStyle w:val="Ttulo1"/>
+        <w:rPr>
+          <w:rFonts w:ascii="Arial" w:eastAsiaTheme="minorHAnsi" w:hAnsi="Arial" w:cs="Arial"/>
+          <w:bCs w:val="0"/>
+          <w:color w:val="auto"/>
+          <w:sz w:val="28"/>
+          <w:lang w:val="es-EC"/>
+        </w:rPr>
       </w:pPr>
-      <w:r>
+      <w:bookmarkStart w:id="11" w:name="_Toc235221208"/>
+      <w:r>
+        <w:rPr>
+          <w:rFonts w:ascii="Arial" w:eastAsiaTheme="minorHAnsi" w:hAnsi="Arial" w:cs="Arial"/>
+          <w:bCs w:val="0"/>
+          <w:color w:val="auto"/>
+          <w:sz w:val="28"/>
+          <w:lang w:val="es-EC"/>
+        </w:rPr>
         <w:t>Observaciones de integración</w:t>
       </w:r>
+      <w:bookmarkEnd w:id="11"/>
     </w:p>
     <w:p>
       <w:pPr>
         <w:pStyle w:val="Listaconvietas"/>
+        <w:spacing w:line="360" w:lineRule="auto"/>
       </w:pPr>
       <w:r>
         <w:t>La configuración se mantiene solo en memoria y vuelve a los valores predeterminados al reiniciar la API.</w:t>
@@ -2716,6 +4467,7 @@
     <w:p>
       <w:pPr>
         <w:pStyle w:val="Listaconvietas"/>
+        <w:spacing w:line="360" w:lineRule="auto"/>
       </w:pPr>
       <w:r>
         <w:rPr>
@@ -2723,8 +4475,18 @@
           <w:color w:val="404040"/>
           <w:sz w:val="19"/>
         </w:rPr>
-        <w:t>/train</w:t>
-      </w:r>
+        <w:t>/</w:t>
+      </w:r>
+      <w:proofErr w:type="gramStart"/>
+      <w:r>
+        <w:rPr>
+          <w:rFonts w:ascii="Consolas" w:hAnsi="Consolas"/>
+          <w:color w:val="404040"/>
+          <w:sz w:val="19"/>
+        </w:rPr>
+        <w:t>train</w:t>
+      </w:r>
+      <w:proofErr w:type="gramEnd"/>
       <w:r>
         <w:t xml:space="preserve"> mantiene abierta la conexión hasta terminar.</w:t>
       </w:r>
@@ -2732,6 +4494,7 @@
     <w:p>
       <w:pPr>
         <w:pStyle w:val="Listaconvietas"/>
+        <w:spacing w:line="360" w:lineRule="auto"/>
       </w:pPr>
       <w:r>
         <w:t xml:space="preserve">El frontend espera porcentajes en </w:t>
@@ -2751,6 +4514,7 @@
     <w:p>
       <w:pPr>
         <w:pStyle w:val="Listaconvietas"/>
+        <w:spacing w:line="360" w:lineRule="auto"/>
       </w:pPr>
       <w:r>
         <w:t>No se implementan versionado de API, autenticación ni rate limiting.</w:t>
@@ -3083,6 +4847,12 @@
   </w:num>
   <w:num w:numId="9">
     <w:abstractNumId w:val="0"/>
+  </w:num>
+  <w:num w:numId="10">
+    <w:abstractNumId w:val="8"/>
+  </w:num>
+  <w:num w:numId="11">
+    <w:abstractNumId w:val="8"/>
   </w:num>
 </w:numbering>
 </file>
@@ -4403,7 +6173,6 @@
     <w:basedOn w:val="Ttulo1"/>
     <w:next w:val="Normal"/>
     <w:uiPriority w:val="39"/>
-    <w:semiHidden/>
     <w:unhideWhenUsed/>
     <w:qFormat/>
     <w:rsid w:val="00FC693F"/>
@@ -14464,6 +16233,86 @@
         <w:shd w:val="clear" w:color="auto" w:fill="FBCAA2" w:themeFill="accent6" w:themeFillTint="7F"/>
       </w:tcPr>
     </w:tblStylePr>
+  </w:style>
+  <w:style w:type="paragraph" w:styleId="TDC1">
+    <w:name w:val="toc 1"/>
+    <w:basedOn w:val="Normal"/>
+    <w:next w:val="Normal"/>
+    <w:autoRedefine/>
+    <w:uiPriority w:val="39"/>
+    <w:unhideWhenUsed/>
+    <w:rsid w:val="009002F1"/>
+    <w:pPr>
+      <w:spacing w:after="100"/>
+    </w:pPr>
+  </w:style>
+  <w:style w:type="character" w:styleId="Hipervnculo">
+    <w:name w:val="Hyperlink"/>
+    <w:basedOn w:val="Fuentedeprrafopredeter"/>
+    <w:uiPriority w:val="99"/>
+    <w:unhideWhenUsed/>
+    <w:rsid w:val="009002F1"/>
+    <w:rPr>
+      <w:color w:val="0000FF" w:themeColor="hyperlink"/>
+      <w:u w:val="single"/>
+    </w:rPr>
+  </w:style>
+  <w:style w:type="paragraph" w:customStyle="1" w:styleId="Titulos">
+    <w:name w:val="Titulos"/>
+    <w:basedOn w:val="Normal"/>
+    <w:next w:val="Ttulo1"/>
+    <w:link w:val="TitulosCar"/>
+    <w:qFormat/>
+    <w:rsid w:val="009002F1"/>
+    <w:pPr>
+      <w:spacing w:after="160" w:line="259" w:lineRule="auto"/>
+      <w:jc w:val="center"/>
+    </w:pPr>
+    <w:rPr>
+      <w:rFonts w:eastAsiaTheme="minorHAnsi" w:cs="Arial"/>
+      <w:b/>
+      <w:sz w:val="28"/>
+      <w:szCs w:val="28"/>
+      <w:lang w:val="es-EC"/>
+    </w:rPr>
+  </w:style>
+  <w:style w:type="character" w:customStyle="1" w:styleId="TitulosCar">
+    <w:name w:val="Titulos Car"/>
+    <w:basedOn w:val="Fuentedeprrafopredeter"/>
+    <w:link w:val="Titulos"/>
+    <w:rsid w:val="009002F1"/>
+    <w:rPr>
+      <w:rFonts w:ascii="Arial" w:eastAsiaTheme="minorHAnsi" w:hAnsi="Arial" w:cs="Arial"/>
+      <w:b/>
+      <w:sz w:val="28"/>
+      <w:szCs w:val="28"/>
+      <w:lang w:val="es-EC"/>
+    </w:rPr>
+  </w:style>
+  <w:style w:type="paragraph" w:customStyle="1" w:styleId="Texto">
+    <w:name w:val="Texto"/>
+    <w:basedOn w:val="Normal"/>
+    <w:link w:val="TextoCar"/>
+    <w:qFormat/>
+    <w:rsid w:val="009F5B11"/>
+    <w:pPr>
+      <w:spacing w:after="160" w:line="360" w:lineRule="auto"/>
+      <w:jc w:val="both"/>
+    </w:pPr>
+    <w:rPr>
+      <w:rFonts w:eastAsiaTheme="minorHAnsi" w:cs="Arial"/>
+      <w:lang w:val="es-EC"/>
+    </w:rPr>
+  </w:style>
+  <w:style w:type="character" w:customStyle="1" w:styleId="TextoCar">
+    <w:name w:val="Texto Car"/>
+    <w:basedOn w:val="Fuentedeprrafopredeter"/>
+    <w:link w:val="Texto"/>
+    <w:rsid w:val="009F5B11"/>
+    <w:rPr>
+      <w:rFonts w:ascii="Arial" w:eastAsiaTheme="minorHAnsi" w:hAnsi="Arial" w:cs="Arial"/>
+      <w:lang w:val="es-EC"/>
+    </w:rPr>
   </w:style>
 </w:styles>
 </file>

</xml_diff>